<commit_message>
Final: Added UTM logo, execution logs, schema docs. Clean 5-file structure for demo.
</commit_message>
<xml_diff>
--- a/docs/AI_Agent_Segmentation_Final_Report.docx
+++ b/docs/AI_Agent_Segmentation_Final_Report.docx
@@ -2,6 +2,47 @@
 <file path=word/document.xml><?xml version="1.0" encoding="utf-8"?>
 <w:document xmlns:wpc="http://schemas.microsoft.com/office/word/2010/wordprocessingCanvas" xmlns:mo="http://schemas.microsoft.com/office/mac/office/2008/main" xmlns:mc="http://schemas.openxmlformats.org/markup-compatibility/2006" xmlns:mv="urn:schemas-microsoft-com:mac:vml" xmlns:o="urn:schemas-microsoft-com:office:office" xmlns:r="http://schemas.openxmlformats.org/officeDocument/2006/relationships" xmlns:m="http://schemas.openxmlformats.org/officeDocument/2006/math" xmlns:v="urn:schemas-microsoft-com:vml" xmlns:wp14="http://schemas.microsoft.com/office/word/2010/wordprocessingDrawing" xmlns:wp="http://schemas.openxmlformats.org/drawingml/2006/wordprocessingDrawing" xmlns:w10="urn:schemas-microsoft-com:office:word" xmlns:w="http://schemas.openxmlformats.org/wordprocessingml/2006/main" xmlns:w14="http://schemas.microsoft.com/office/word/2010/wordml" xmlns:wpg="http://schemas.microsoft.com/office/word/2010/wordprocessingGroup" xmlns:wpi="http://schemas.microsoft.com/office/word/2010/wordprocessingInk" xmlns:wne="http://schemas.microsoft.com/office/word/2006/wordml" xmlns:wps="http://schemas.microsoft.com/office/word/2010/wordprocessingShape" mc:Ignorable="w14 wp14">
   <w:body>
+    <w:p>
+      <w:pPr>
+        <w:spacing w:after="240"/>
+        <w:ind w:firstLine="0"/>
+        <w:jc w:val="center"/>
+      </w:pPr>
+      <w:r>
+        <w:drawing>
+          <wp:inline xmlns:a="http://schemas.openxmlformats.org/drawingml/2006/main" xmlns:pic="http://schemas.openxmlformats.org/drawingml/2006/picture">
+            <wp:extent cx="2286000" cy="774650"/>
+            <wp:docPr id="1" name="Picture 1"/>
+            <wp:cNvGraphicFramePr>
+              <a:graphicFrameLocks noChangeAspect="1"/>
+            </wp:cNvGraphicFramePr>
+            <a:graphic>
+              <a:graphicData uri="http://schemas.openxmlformats.org/drawingml/2006/picture">
+                <pic:pic>
+                  <pic:nvPicPr>
+                    <pic:cNvPr id="0" name="template_logo.png"/>
+                    <pic:cNvPicPr/>
+                  </pic:nvPicPr>
+                  <pic:blipFill>
+                    <a:blip r:embed="rId9"/>
+                    <a:stretch>
+                      <a:fillRect/>
+                    </a:stretch>
+                  </pic:blipFill>
+                  <pic:spPr>
+                    <a:xfrm>
+                      <a:off x="0" y="0"/>
+                      <a:ext cx="2286000" cy="774650"/>
+                    </a:xfrm>
+                    <a:prstGeom prst="rect"/>
+                  </pic:spPr>
+                </pic:pic>
+              </a:graphicData>
+            </a:graphic>
+          </wp:inline>
+        </w:drawing>
+      </w:r>
+    </w:p>
     <w:p>
       <w:pPr>
         <w:spacing w:after="240" w:line="276" w:lineRule="auto"/>
@@ -23,10 +64,9 @@
           <w:b w:val="0"/>
           <w:sz w:val="24"/>
         </w:rPr>
-        <w:t>Course: SECP3843-01 Special Topics (Data Engineering &amp; AI Automation)</w:t>
+        <w:t>Course: SECP3843-01 Special Topics</w:t>
         <w:br/>
         <w:t>Final Individual Project Report</w:t>
-        <w:br/>
         <w:br/>
         <w:br/>
         <w:br/>
@@ -187,7 +227,7 @@
         <w:drawing>
           <wp:inline xmlns:a="http://schemas.openxmlformats.org/drawingml/2006/main" xmlns:pic="http://schemas.openxmlformats.org/drawingml/2006/picture">
             <wp:extent cx="4114800" cy="2037647"/>
-            <wp:docPr id="1" name="Picture 1"/>
+            <wp:docPr id="2" name="Picture 2"/>
             <wp:cNvGraphicFramePr>
               <a:graphicFrameLocks noChangeAspect="1"/>
             </wp:cNvGraphicFramePr>
@@ -199,7 +239,7 @@
                     <pic:cNvPicPr/>
                   </pic:nvPicPr>
                   <pic:blipFill>
-                    <a:blip r:embed="rId9"/>
+                    <a:blip r:embed="rId10"/>
                     <a:stretch>
                       <a:fillRect/>
                     </a:stretch>
@@ -476,7 +516,7 @@
         <w:drawing>
           <wp:inline xmlns:a="http://schemas.openxmlformats.org/drawingml/2006/main" xmlns:pic="http://schemas.openxmlformats.org/drawingml/2006/picture">
             <wp:extent cx="4114800" cy="2480240"/>
-            <wp:docPr id="2" name="Picture 2"/>
+            <wp:docPr id="3" name="Picture 3"/>
             <wp:cNvGraphicFramePr>
               <a:graphicFrameLocks noChangeAspect="1"/>
             </wp:cNvGraphicFramePr>
@@ -488,7 +528,7 @@
                     <pic:cNvPicPr/>
                   </pic:nvPicPr>
                   <pic:blipFill>
-                    <a:blip r:embed="rId10"/>
+                    <a:blip r:embed="rId11"/>
                     <a:stretch>
                       <a:fillRect/>
                     </a:stretch>
@@ -653,7 +693,7 @@
         <w:drawing>
           <wp:inline xmlns:a="http://schemas.openxmlformats.org/drawingml/2006/main" xmlns:pic="http://schemas.openxmlformats.org/drawingml/2006/picture">
             <wp:extent cx="2926080" cy="1950720"/>
-            <wp:docPr id="3" name="Picture 3"/>
+            <wp:docPr id="4" name="Picture 4"/>
             <wp:cNvGraphicFramePr>
               <a:graphicFrameLocks noChangeAspect="1"/>
             </wp:cNvGraphicFramePr>
@@ -665,7 +705,7 @@
                     <pic:cNvPicPr/>
                   </pic:nvPicPr>
                   <pic:blipFill>
-                    <a:blip r:embed="rId11"/>
+                    <a:blip r:embed="rId12"/>
                     <a:stretch>
                       <a:fillRect/>
                     </a:stretch>
@@ -710,7 +750,7 @@
         <w:drawing>
           <wp:inline xmlns:a="http://schemas.openxmlformats.org/drawingml/2006/main" xmlns:pic="http://schemas.openxmlformats.org/drawingml/2006/picture">
             <wp:extent cx="2926080" cy="2438400"/>
-            <wp:docPr id="4" name="Picture 4"/>
+            <wp:docPr id="5" name="Picture 5"/>
             <wp:cNvGraphicFramePr>
               <a:graphicFrameLocks noChangeAspect="1"/>
             </wp:cNvGraphicFramePr>
@@ -722,7 +762,7 @@
                     <pic:cNvPicPr/>
                   </pic:nvPicPr>
                   <pic:blipFill>
-                    <a:blip r:embed="rId12"/>
+                    <a:blip r:embed="rId13"/>
                     <a:stretch>
                       <a:fillRect/>
                     </a:stretch>
@@ -767,7 +807,7 @@
         <w:drawing>
           <wp:inline xmlns:a="http://schemas.openxmlformats.org/drawingml/2006/main" xmlns:pic="http://schemas.openxmlformats.org/drawingml/2006/picture">
             <wp:extent cx="3657600" cy="2032000"/>
-            <wp:docPr id="5" name="Picture 5"/>
+            <wp:docPr id="6" name="Picture 6"/>
             <wp:cNvGraphicFramePr>
               <a:graphicFrameLocks noChangeAspect="1"/>
             </wp:cNvGraphicFramePr>
@@ -779,7 +819,7 @@
                     <pic:cNvPicPr/>
                   </pic:nvPicPr>
                   <pic:blipFill>
-                    <a:blip r:embed="rId13"/>
+                    <a:blip r:embed="rId14"/>
                     <a:stretch>
                       <a:fillRect/>
                     </a:stretch>
@@ -845,6 +885,127 @@
           <w:sz w:val="22"/>
         </w:rPr>
         <w:t>This project successfully built a unified Data Lakehouse and ML pipeline to evaluate agentic AI. Our analysis revealed a critical trust gap: while Technology agents lead in raw productivity, they suffer from a -16.23% trust gap, whereas Government agents enjoy a positive trust surplus. Based on these findings, we recommend: (1) Restricting AI autonomy in Tech domains to rebuild user trust; (2) Tuning response latency thresholds to prevent cognitive fatigue; and (3) Implementing star schema reporting to track model drift in real time.</w:t>
+      </w:r>
+    </w:p>
+    <w:p>
+      <w:pPr>
+        <w:keepNext/>
+        <w:spacing w:after="160" w:line="276" w:lineRule="auto"/>
+        <w:jc w:val="left"/>
+      </w:pPr>
+      <w:r>
+        <w:rPr>
+          <w:rFonts w:ascii="Times New Roman" w:hAnsi="Times New Roman"/>
+          <w:b/>
+          <w:color w:val="000000"/>
+          <w:sz w:val="26"/>
+        </w:rPr>
+        <w:t>References</w:t>
+      </w:r>
+    </w:p>
+    <w:p>
+      <w:pPr>
+        <w:spacing w:after="40" w:line="276" w:lineRule="auto"/>
+        <w:jc w:val="both"/>
+      </w:pPr>
+      <w:r>
+        <w:rPr>
+          <w:rFonts w:ascii="Times New Roman" w:hAnsi="Times New Roman"/>
+          <w:i/>
+          <w:color w:val="000000"/>
+          <w:sz w:val="20"/>
+        </w:rPr>
+        <w:t>[1] Park, J.S., O'Brien, J.C., Cai, C.J., et al. (2023). Generative Agents: Interactive Simulacra of Human Behavior. arXiv preprint arXiv:2304.03442.</w:t>
+      </w:r>
+    </w:p>
+    <w:p>
+      <w:pPr>
+        <w:spacing w:after="40" w:line="276" w:lineRule="auto"/>
+        <w:jc w:val="both"/>
+      </w:pPr>
+      <w:r>
+        <w:rPr>
+          <w:rFonts w:ascii="Times New Roman" w:hAnsi="Times New Roman"/>
+          <w:i/>
+          <w:color w:val="000000"/>
+          <w:sz w:val="20"/>
+        </w:rPr>
+        <w:t>[2] Yao, S., Zhao, J., Yu, D., et al. (2022). ReAct: Synergizing Reasoning and Acting in Language Models. arXiv preprint arXiv:2210.03629.</w:t>
+      </w:r>
+    </w:p>
+    <w:p>
+      <w:pPr>
+        <w:spacing w:after="40" w:line="276" w:lineRule="auto"/>
+        <w:jc w:val="both"/>
+      </w:pPr>
+      <w:r>
+        <w:rPr>
+          <w:rFonts w:ascii="Times New Roman" w:hAnsi="Times New Roman"/>
+          <w:i/>
+          <w:color w:val="000000"/>
+          <w:sz w:val="20"/>
+        </w:rPr>
+        <w:t>[3] Schick, T., Dwivedi-Yu, J., Dessì, R., et al. (2023). Toolformer: Language Models Can Teach Themselves to Use Tools. arXiv preprint arXiv:2302.04761.</w:t>
+      </w:r>
+    </w:p>
+    <w:p>
+      <w:pPr>
+        <w:spacing w:after="40" w:line="276" w:lineRule="auto"/>
+        <w:jc w:val="both"/>
+      </w:pPr>
+      <w:r>
+        <w:rPr>
+          <w:rFonts w:ascii="Times New Roman" w:hAnsi="Times New Roman"/>
+          <w:i/>
+          <w:color w:val="000000"/>
+          <w:sz w:val="20"/>
+        </w:rPr>
+        <w:t>[4] Wang, L., Chen, C., Pei, J., et al. (2024). A Survey on Large Language Model based Autonomous Agents. arXiv preprint arXiv:2308.11432.</w:t>
+      </w:r>
+    </w:p>
+    <w:p>
+      <w:pPr>
+        <w:spacing w:after="40" w:line="276" w:lineRule="auto"/>
+        <w:jc w:val="both"/>
+      </w:pPr>
+      <w:r>
+        <w:rPr>
+          <w:rFonts w:ascii="Times New Roman" w:hAnsi="Times New Roman"/>
+          <w:i/>
+          <w:color w:val="000000"/>
+          <w:sz w:val="20"/>
+        </w:rPr>
+        <w:t>[5] Armbrust, M., Ghodsi, A., Xin, R., et al. (2021). Lakehouse: A New Generation of Open Platforms that Unify Data Warehousing and Advanced Analytics. In Proceedings of CIDR 2021.</w:t>
+      </w:r>
+    </w:p>
+    <w:p>
+      <w:pPr>
+        <w:spacing w:after="40" w:line="276" w:lineRule="auto"/>
+        <w:jc w:val="both"/>
+      </w:pPr>
+      <w:r>
+        <w:rPr>
+          <w:rFonts w:ascii="Times New Roman" w:hAnsi="Times New Roman"/>
+          <w:i/>
+          <w:color w:val="000000"/>
+          <w:sz w:val="20"/>
+        </w:rPr>
+        <w:t>[6] Armbrust, M., Xin, R.S., Lian, C., et al. (2015). Spark SQL: Relational Data Processing in Spark. In Proceedings of SIGMOD 2015, pp. 1383-1394.</w:t>
+      </w:r>
+    </w:p>
+    <w:p>
+      <w:pPr>
+        <w:spacing w:after="40" w:line="276" w:lineRule="auto"/>
+        <w:jc w:val="both"/>
+      </w:pPr>
+      <w:r>
+        <w:rPr>
+          <w:rFonts w:ascii="Times New Roman" w:hAnsi="Times New Roman"/>
+          <w:i/>
+          <w:color w:val="000000"/>
+          <w:sz w:val="20"/>
+        </w:rPr>
+        <w:t>[7] Pedregosa, F., Varoquaux, G., Gramfort, A., et al. (2011). Scikit-learn: Machine Learning in Python. Journal of Machine Learning Research, 12, 2825-2830.</w:t>
       </w:r>
     </w:p>
     <w:sectPr>

</xml_diff>